<commit_message>
Add EEP documentation and country flags
</commit_message>
<xml_diff>
--- a/documentation/EEP_Specification_v1.2.docx
+++ b/documentation/EEP_Specification_v1.2.docx
@@ -3278,160 +3278,238 @@
     </w:p>
     <w:p>
       <w:pPr>
-        <w:pStyle w:val="BodyText"/>
-      </w:pPr>
-      <w:r>
+        <w:pStyle w:val="SourceCode"/>
+      </w:pPr>
+      <w:r>
+        <w:rPr>
+          <w:rStyle w:val="VerbatimChar"/>
+        </w:rPr>
         <w:t xml:space="preserve">Root Object</w:t>
       </w:r>
       <w:r>
-        <w:t xml:space="preserve"> </w:t>
-      </w:r>
-      <w:r>
+        <w:br/>
+      </w:r>
+      <w:r>
+        <w:rPr>
+          <w:rStyle w:val="VerbatimChar"/>
+        </w:rPr>
         <w:t xml:space="preserve">|</w:t>
       </w:r>
       <w:r>
-        <w:t xml:space="preserve"> </w:t>
-      </w:r>
-      <w:r>
-        <w:t xml:space="preserve">+– calculation_id</w:t>
-      </w:r>
-      <w:r>
-        <w:t xml:space="preserve"> </w:t>
-      </w:r>
-      <w:r>
+        <w:br/>
+      </w:r>
+      <w:r>
+        <w:rPr>
+          <w:rStyle w:val="VerbatimChar"/>
+        </w:rPr>
+        <w:t xml:space="preserve">+-- calculation_id</w:t>
+      </w:r>
+      <w:r>
+        <w:br/>
+      </w:r>
+      <w:r>
+        <w:rPr>
+          <w:rStyle w:val="VerbatimChar"/>
+        </w:rPr>
         <w:t xml:space="preserve">|</w:t>
       </w:r>
       <w:r>
-        <w:t xml:space="preserve"> </w:t>
-      </w:r>
-      <w:r>
-        <w:t xml:space="preserve">+– mode</w:t>
-      </w:r>
-      <w:r>
-        <w:t xml:space="preserve"> </w:t>
-      </w:r>
-      <w:r>
+        <w:br/>
+      </w:r>
+      <w:r>
+        <w:rPr>
+          <w:rStyle w:val="VerbatimChar"/>
+        </w:rPr>
+        <w:t xml:space="preserve">+-- mode</w:t>
+      </w:r>
+      <w:r>
+        <w:br/>
+      </w:r>
+      <w:r>
+        <w:rPr>
+          <w:rStyle w:val="VerbatimChar"/>
+        </w:rPr>
         <w:t xml:space="preserve">|</w:t>
       </w:r>
       <w:r>
-        <w:t xml:space="preserve"> </w:t>
-      </w:r>
-      <w:r>
-        <w:t xml:space="preserve">+– race</w:t>
-      </w:r>
-      <w:r>
-        <w:t xml:space="preserve"> </w:t>
-      </w:r>
-      <w:r>
-        <w:t xml:space="preserve">| |</w:t>
-      </w:r>
-      <w:r>
-        <w:t xml:space="preserve"> </w:t>
-      </w:r>
-      <w:r>
-        <w:t xml:space="preserve">| +– season</w:t>
-      </w:r>
-      <w:r>
-        <w:t xml:space="preserve"> </w:t>
-      </w:r>
-      <w:r>
-        <w:t xml:space="preserve">| +– codex</w:t>
-      </w:r>
-      <w:r>
-        <w:t xml:space="preserve"> </w:t>
-      </w:r>
-      <w:r>
-        <w:t xml:space="preserve">| +– run</w:t>
-      </w:r>
-      <w:r>
-        <w:t xml:space="preserve"> </w:t>
-      </w:r>
-      <w:r>
-        <w:t xml:space="preserve">| +– missing_impulse</w:t>
-      </w:r>
-      <w:r>
-        <w:t xml:space="preserve"> </w:t>
-      </w:r>
-      <w:r>
-        <w:t xml:space="preserve">| +– eet_bib</w:t>
-      </w:r>
-      <w:r>
-        <w:t xml:space="preserve"> </w:t>
-      </w:r>
-      <w:r>
-        <w:t xml:space="preserve">| +– name</w:t>
-      </w:r>
-      <w:r>
-        <w:t xml:space="preserve"> </w:t>
-      </w:r>
-      <w:r>
-        <w:t xml:space="preserve">| +– discipline</w:t>
-      </w:r>
-      <w:r>
-        <w:t xml:space="preserve"> </w:t>
-      </w:r>
-      <w:r>
-        <w:t xml:space="preserve">| +– date</w:t>
-      </w:r>
-      <w:r>
-        <w:t xml:space="preserve"> </w:t>
-      </w:r>
-      <w:r>
-        <w:t xml:space="preserve">| +– location</w:t>
-      </w:r>
-      <w:r>
-        <w:t xml:space="preserve"> </w:t>
-      </w:r>
-      <w:r>
+        <w:br/>
+      </w:r>
+      <w:r>
+        <w:rPr>
+          <w:rStyle w:val="VerbatimChar"/>
+        </w:rPr>
+        <w:t xml:space="preserve">+-- race</w:t>
+      </w:r>
+      <w:r>
+        <w:br/>
+      </w:r>
+      <w:r>
+        <w:rPr>
+          <w:rStyle w:val="VerbatimChar"/>
+        </w:rPr>
+        <w:t xml:space="preserve">|   |</w:t>
+      </w:r>
+      <w:r>
+        <w:br/>
+      </w:r>
+      <w:r>
+        <w:rPr>
+          <w:rStyle w:val="VerbatimChar"/>
+        </w:rPr>
+        <w:t xml:space="preserve">|   +-- season</w:t>
+      </w:r>
+      <w:r>
+        <w:br/>
+      </w:r>
+      <w:r>
+        <w:rPr>
+          <w:rStyle w:val="VerbatimChar"/>
+        </w:rPr>
+        <w:t xml:space="preserve">|   +-- codex</w:t>
+      </w:r>
+      <w:r>
+        <w:br/>
+      </w:r>
+      <w:r>
+        <w:rPr>
+          <w:rStyle w:val="VerbatimChar"/>
+        </w:rPr>
+        <w:t xml:space="preserve">|   +-- run</w:t>
+      </w:r>
+      <w:r>
+        <w:br/>
+      </w:r>
+      <w:r>
+        <w:rPr>
+          <w:rStyle w:val="VerbatimChar"/>
+        </w:rPr>
+        <w:t xml:space="preserve">|   +-- missing_impulse</w:t>
+      </w:r>
+      <w:r>
+        <w:br/>
+      </w:r>
+      <w:r>
+        <w:rPr>
+          <w:rStyle w:val="VerbatimChar"/>
+        </w:rPr>
+        <w:t xml:space="preserve">|   +-- eet_bib</w:t>
+      </w:r>
+      <w:r>
+        <w:br/>
+      </w:r>
+      <w:r>
+        <w:rPr>
+          <w:rStyle w:val="VerbatimChar"/>
+        </w:rPr>
+        <w:t xml:space="preserve">|   +-- name</w:t>
+      </w:r>
+      <w:r>
+        <w:br/>
+      </w:r>
+      <w:r>
+        <w:rPr>
+          <w:rStyle w:val="VerbatimChar"/>
+        </w:rPr>
+        <w:t xml:space="preserve">|   +-- discipline</w:t>
+      </w:r>
+      <w:r>
+        <w:br/>
+      </w:r>
+      <w:r>
+        <w:rPr>
+          <w:rStyle w:val="VerbatimChar"/>
+        </w:rPr>
+        <w:t xml:space="preserve">|   +-- date</w:t>
+      </w:r>
+      <w:r>
+        <w:br/>
+      </w:r>
+      <w:r>
+        <w:rPr>
+          <w:rStyle w:val="VerbatimChar"/>
+        </w:rPr>
+        <w:t xml:space="preserve">|   +-- location</w:t>
+      </w:r>
+      <w:r>
+        <w:br/>
+      </w:r>
+      <w:r>
+        <w:rPr>
+          <w:rStyle w:val="VerbatimChar"/>
+        </w:rPr>
         <w:t xml:space="preserve">|</w:t>
       </w:r>
       <w:r>
-        <w:t xml:space="preserve"> </w:t>
-      </w:r>
-      <w:r>
-        <w:t xml:space="preserve">+– competitors[]</w:t>
-      </w:r>
-      <w:r>
-        <w:t xml:space="preserve"> </w:t>
-      </w:r>
-      <w:r>
-        <w:t xml:space="preserve">|</w:t>
-      </w:r>
-      <w:r>
-        <w:t xml:space="preserve"> </w:t>
-      </w:r>
-      <w:r>
-        <w:t xml:space="preserve">+– bib</w:t>
-      </w:r>
-      <w:r>
-        <w:t xml:space="preserve"> </w:t>
-      </w:r>
-      <w:r>
-        <w:t xml:space="preserve">+– et_tod</w:t>
-      </w:r>
-      <w:r>
-        <w:t xml:space="preserve"> </w:t>
-      </w:r>
-      <w:r>
-        <w:t xml:space="preserve">+– name</w:t>
-      </w:r>
-      <w:r>
-        <w:t xml:space="preserve"> </w:t>
-      </w:r>
-      <w:r>
-        <w:t xml:space="preserve">+– surname</w:t>
-      </w:r>
-      <w:r>
-        <w:t xml:space="preserve"> </w:t>
-      </w:r>
-      <w:r>
-        <w:t xml:space="preserve">+– nation</w:t>
-      </w:r>
-      <w:r>
-        <w:t xml:space="preserve"> </w:t>
-      </w:r>
-      <w:r>
-        <w:t xml:space="preserve">+– club</w:t>
+        <w:br/>
+      </w:r>
+      <w:r>
+        <w:rPr>
+          <w:rStyle w:val="VerbatimChar"/>
+        </w:rPr>
+        <w:t xml:space="preserve">+-- competitors[]</w:t>
+      </w:r>
+      <w:r>
+        <w:br/>
+      </w:r>
+      <w:r>
+        <w:rPr>
+          <w:rStyle w:val="VerbatimChar"/>
+        </w:rPr>
+        <w:t xml:space="preserve">    |</w:t>
+      </w:r>
+      <w:r>
+        <w:br/>
+      </w:r>
+      <w:r>
+        <w:rPr>
+          <w:rStyle w:val="VerbatimChar"/>
+        </w:rPr>
+        <w:t xml:space="preserve">    +-- bib</w:t>
+      </w:r>
+      <w:r>
+        <w:br/>
+      </w:r>
+      <w:r>
+        <w:rPr>
+          <w:rStyle w:val="VerbatimChar"/>
+        </w:rPr>
+        <w:t xml:space="preserve">    +-- et_tod</w:t>
+      </w:r>
+      <w:r>
+        <w:br/>
+      </w:r>
+      <w:r>
+        <w:rPr>
+          <w:rStyle w:val="VerbatimChar"/>
+        </w:rPr>
+        <w:t xml:space="preserve">    +-- name</w:t>
+      </w:r>
+      <w:r>
+        <w:br/>
+      </w:r>
+      <w:r>
+        <w:rPr>
+          <w:rStyle w:val="VerbatimChar"/>
+        </w:rPr>
+        <w:t xml:space="preserve">    +-- surname</w:t>
+      </w:r>
+      <w:r>
+        <w:br/>
+      </w:r>
+      <w:r>
+        <w:rPr>
+          <w:rStyle w:val="VerbatimChar"/>
+        </w:rPr>
+        <w:t xml:space="preserve">    +-- nation</w:t>
+      </w:r>
+      <w:r>
+        <w:br/>
+      </w:r>
+      <w:r>
+        <w:rPr>
+          <w:rStyle w:val="VerbatimChar"/>
+        </w:rPr>
+        <w:t xml:space="preserve">    +-- club</w:t>
       </w:r>
     </w:p>
     <w:bookmarkEnd w:id="24"/>

</xml_diff>

<commit_message>
Clarify JSON null value handling
</commit_message>
<xml_diff>
--- a/documentation/EEP_Specification_v1.2.docx
+++ b/documentation/EEP_Specification_v1.2.docx
@@ -8263,12 +8263,13 @@
     <w:tbl>
       <w:tblPr>
         <w:tblStyle w:val="Table"/>
-        <w:tblW w:type="auto" w:w="0"/>
+        <w:tblW w:type="pct" w:w="5000"/>
+        <w:tblLayout w:type="fixed"/>
         <w:tblLook w:firstRow="1" w:lastRow="0" w:firstColumn="0" w:lastColumn="0" w:noHBand="0" w:noVBand="0" w:val="0020"/>
       </w:tblPr>
       <w:tblGrid>
-        <w:gridCol w:w="3960"/>
-        <w:gridCol w:w="3960"/>
+        <w:gridCol w:w="6160"/>
+        <w:gridCol w:w="1760"/>
       </w:tblGrid>
       <w:tr>
         <w:trPr>
@@ -8279,7 +8280,6 @@
           <w:p>
             <w:pPr>
               <w:pStyle w:val="Compact"/>
-              <w:jc w:val="left"/>
             </w:pPr>
             <w:r>
               <w:t xml:space="preserve">Convention</w:t>
@@ -8291,7 +8291,6 @@
           <w:p>
             <w:pPr>
               <w:pStyle w:val="Compact"/>
-              <w:jc w:val="left"/>
             </w:pPr>
             <w:r>
               <w:t xml:space="preserve">Rule</w:t>
@@ -8305,7 +8304,6 @@
           <w:p>
             <w:pPr>
               <w:pStyle w:val="Compact"/>
-              <w:jc w:val="left"/>
             </w:pPr>
             <w:r>
               <w:t xml:space="preserve">Member names</w:t>
@@ -8317,7 +8315,6 @@
           <w:p>
             <w:pPr>
               <w:pStyle w:val="Compact"/>
-              <w:jc w:val="left"/>
             </w:pPr>
             <w:r>
               <w:t xml:space="preserve">lowercase</w:t>
@@ -8331,7 +8328,6 @@
           <w:p>
             <w:pPr>
               <w:pStyle w:val="Compact"/>
-              <w:jc w:val="left"/>
             </w:pPr>
             <w:r>
               <w:t xml:space="preserve">Word separator</w:t>
@@ -8343,7 +8339,6 @@
           <w:p>
             <w:pPr>
               <w:pStyle w:val="Compact"/>
-              <w:jc w:val="left"/>
             </w:pPr>
             <w:r>
               <w:t xml:space="preserve">underscore (</w:t>
@@ -8366,7 +8361,6 @@
           <w:p>
             <w:pPr>
               <w:pStyle w:val="Compact"/>
-              <w:jc w:val="left"/>
             </w:pPr>
             <w:r>
               <w:t xml:space="preserve">Arrays</w:t>
@@ -8378,7 +8372,6 @@
           <w:p>
             <w:pPr>
               <w:pStyle w:val="Compact"/>
-              <w:jc w:val="left"/>
             </w:pPr>
             <w:r>
               <w:t xml:space="preserve">plural nouns</w:t>
@@ -8392,7 +8385,6 @@
           <w:p>
             <w:pPr>
               <w:pStyle w:val="Compact"/>
-              <w:jc w:val="left"/>
             </w:pPr>
             <w:r>
               <w:t xml:space="preserve">Boolean values</w:t>
@@ -8404,7 +8396,6 @@
           <w:p>
             <w:pPr>
               <w:pStyle w:val="Compact"/>
-              <w:jc w:val="left"/>
             </w:pPr>
             <w:r>
               <w:t xml:space="preserve">JSON</w:t>
@@ -8442,22 +8433,29 @@
           <w:p>
             <w:pPr>
               <w:pStyle w:val="Compact"/>
-              <w:jc w:val="left"/>
-            </w:pPr>
-            <w:r>
-              <w:t xml:space="preserve">Null values</w:t>
-            </w:r>
-          </w:p>
-        </w:tc>
-        <w:tc>
-          <w:tcPr/>
-          <w:p>
-            <w:pPr>
-              <w:pStyle w:val="Compact"/>
-              <w:jc w:val="left"/>
-            </w:pPr>
-            <w:r>
-              <w:t xml:space="preserve">JSON</w:t>
+            </w:pPr>
+            <w:r>
+              <w:t xml:space="preserve">Absent values</w:t>
+            </w:r>
+          </w:p>
+        </w:tc>
+        <w:tc>
+          <w:tcPr/>
+          <w:p>
+            <w:pPr>
+              <w:pStyle w:val="Compact"/>
+            </w:pPr>
+            <w:r>
+              <w:t xml:space="preserve">empty string (</w:t>
+            </w:r>
+            <w:r>
+              <w:rPr>
+                <w:rStyle w:val="VerbatimChar"/>
+              </w:rPr>
+              <w:t xml:space="preserve">""</w:t>
+            </w:r>
+            <w:r>
+              <w:t xml:space="preserve">); JSON</w:t>
             </w:r>
             <w:r>
               <w:t xml:space="preserve"> </w:t>
@@ -8468,6 +8466,12 @@
               </w:rPr>
               <w:t xml:space="preserve">null</w:t>
             </w:r>
+            <w:r>
+              <w:t xml:space="preserve"> </w:t>
+            </w:r>
+            <w:r>
+              <w:t xml:space="preserve">is not permitted</w:t>
+            </w:r>
           </w:p>
         </w:tc>
       </w:tr>
@@ -8477,7 +8481,6 @@
           <w:p>
             <w:pPr>
               <w:pStyle w:val="Compact"/>
-              <w:jc w:val="left"/>
             </w:pPr>
             <w:r>
               <w:t xml:space="preserve">Date format</w:t>
@@ -8489,7 +8492,6 @@
           <w:p>
             <w:pPr>
               <w:pStyle w:val="Compact"/>
-              <w:jc w:val="left"/>
             </w:pPr>
             <w:r>
               <w:t xml:space="preserve">ISO 8601 (</w:t>
@@ -8512,7 +8514,6 @@
           <w:p>
             <w:pPr>
               <w:pStyle w:val="Compact"/>
-              <w:jc w:val="left"/>
             </w:pPr>
             <w:r>
               <w:t xml:space="preserve">Time of Day</w:t>
@@ -8524,7 +8525,6 @@
           <w:p>
             <w:pPr>
               <w:pStyle w:val="Compact"/>
-              <w:jc w:val="left"/>
             </w:pPr>
             <w:r>
               <w:rPr>

</xml_diff>